<commit_message>
Jawed purposely making me upload these docs
</commit_message>
<xml_diff>
--- a/TOP SECRET FILE.docx
+++ b/TOP SECRET FILE.docx
@@ -7,6 +7,1590 @@
         <w:t>TOP SECRET FILE</w:t>
       </w:r>
     </w:p>
+    <w:p/>
+    <w:p/>
+    <w:p>
+      <w:r>
+        <w:t>TOP SECRET FILE</w:t>
+      </w:r>
+    </w:p>
+    <w:p/>
+    <w:p>
+      <w:r>
+        <w:t>TOP SECRET FILE</w:t>
+      </w:r>
+    </w:p>
+    <w:p/>
+    <w:p/>
+    <w:p>
+      <w:r>
+        <w:rPr>
+          <w:noProof/>
+        </w:rPr>
+        <w:drawing>
+          <wp:inline distT="0" distB="0" distL="0" distR="0" wp14:anchorId="1D199F4A" wp14:editId="0D4107D6">
+            <wp:extent cx="5943600" cy="2898140"/>
+            <wp:effectExtent l="0" t="0" r="0" b="0"/>
+            <wp:docPr id="512490497" name="Picture 1"/>
+            <wp:cNvGraphicFramePr>
+              <a:graphicFrameLocks xmlns:a="http://schemas.openxmlformats.org/drawingml/2006/main" noChangeAspect="1"/>
+            </wp:cNvGraphicFramePr>
+            <a:graphic xmlns:a="http://schemas.openxmlformats.org/drawingml/2006/main">
+              <a:graphicData uri="http://schemas.openxmlformats.org/drawingml/2006/picture">
+                <pic:pic xmlns:pic="http://schemas.openxmlformats.org/drawingml/2006/picture">
+                  <pic:nvPicPr>
+                    <pic:cNvPr id="512490497" name=""/>
+                    <pic:cNvPicPr/>
+                  </pic:nvPicPr>
+                  <pic:blipFill>
+                    <a:blip r:embed="rId4"/>
+                    <a:stretch>
+                      <a:fillRect/>
+                    </a:stretch>
+                  </pic:blipFill>
+                  <pic:spPr>
+                    <a:xfrm>
+                      <a:off x="0" y="0"/>
+                      <a:ext cx="5943600" cy="2898140"/>
+                    </a:xfrm>
+                    <a:prstGeom prst="rect">
+                      <a:avLst/>
+                    </a:prstGeom>
+                  </pic:spPr>
+                </pic:pic>
+              </a:graphicData>
+            </a:graphic>
+          </wp:inline>
+        </w:drawing>
+      </w:r>
+    </w:p>
+    <w:p>
+      <w:r>
+        <w:rPr>
+          <w:noProof/>
+        </w:rPr>
+        <w:lastRenderedPageBreak/>
+        <w:drawing>
+          <wp:inline distT="0" distB="0" distL="0" distR="0" wp14:anchorId="48FF53D7" wp14:editId="7EBF8FAF">
+            <wp:extent cx="5943600" cy="3801110"/>
+            <wp:effectExtent l="0" t="0" r="0" b="8890"/>
+            <wp:docPr id="1266862929" name="Picture 1"/>
+            <wp:cNvGraphicFramePr>
+              <a:graphicFrameLocks xmlns:a="http://schemas.openxmlformats.org/drawingml/2006/main" noChangeAspect="1"/>
+            </wp:cNvGraphicFramePr>
+            <a:graphic xmlns:a="http://schemas.openxmlformats.org/drawingml/2006/main">
+              <a:graphicData uri="http://schemas.openxmlformats.org/drawingml/2006/picture">
+                <pic:pic xmlns:pic="http://schemas.openxmlformats.org/drawingml/2006/picture">
+                  <pic:nvPicPr>
+                    <pic:cNvPr id="1266862929" name=""/>
+                    <pic:cNvPicPr/>
+                  </pic:nvPicPr>
+                  <pic:blipFill>
+                    <a:blip r:embed="rId5"/>
+                    <a:stretch>
+                      <a:fillRect/>
+                    </a:stretch>
+                  </pic:blipFill>
+                  <pic:spPr>
+                    <a:xfrm>
+                      <a:off x="0" y="0"/>
+                      <a:ext cx="5943600" cy="3801110"/>
+                    </a:xfrm>
+                    <a:prstGeom prst="rect">
+                      <a:avLst/>
+                    </a:prstGeom>
+                  </pic:spPr>
+                </pic:pic>
+              </a:graphicData>
+            </a:graphic>
+          </wp:inline>
+        </w:drawing>
+      </w:r>
+      <w:r>
+        <w:rPr>
+          <w:noProof/>
+        </w:rPr>
+        <w:drawing>
+          <wp:inline distT="0" distB="0" distL="0" distR="0" wp14:anchorId="79D4854B" wp14:editId="4F1E5C72">
+            <wp:extent cx="5943600" cy="3801110"/>
+            <wp:effectExtent l="0" t="0" r="0" b="8890"/>
+            <wp:docPr id="2047107121" name="Picture 1"/>
+            <wp:cNvGraphicFramePr>
+              <a:graphicFrameLocks xmlns:a="http://schemas.openxmlformats.org/drawingml/2006/main" noChangeAspect="1"/>
+            </wp:cNvGraphicFramePr>
+            <a:graphic xmlns:a="http://schemas.openxmlformats.org/drawingml/2006/main">
+              <a:graphicData uri="http://schemas.openxmlformats.org/drawingml/2006/picture">
+                <pic:pic xmlns:pic="http://schemas.openxmlformats.org/drawingml/2006/picture">
+                  <pic:nvPicPr>
+                    <pic:cNvPr id="2047107121" name=""/>
+                    <pic:cNvPicPr/>
+                  </pic:nvPicPr>
+                  <pic:blipFill>
+                    <a:blip r:embed="rId5"/>
+                    <a:stretch>
+                      <a:fillRect/>
+                    </a:stretch>
+                  </pic:blipFill>
+                  <pic:spPr>
+                    <a:xfrm>
+                      <a:off x="0" y="0"/>
+                      <a:ext cx="5943600" cy="3801110"/>
+                    </a:xfrm>
+                    <a:prstGeom prst="rect">
+                      <a:avLst/>
+                    </a:prstGeom>
+                  </pic:spPr>
+                </pic:pic>
+              </a:graphicData>
+            </a:graphic>
+          </wp:inline>
+        </w:drawing>
+      </w:r>
+      <w:r>
+        <w:rPr>
+          <w:noProof/>
+        </w:rPr>
+        <w:lastRenderedPageBreak/>
+        <w:drawing>
+          <wp:inline distT="0" distB="0" distL="0" distR="0" wp14:anchorId="31F43F5E" wp14:editId="12F4CC31">
+            <wp:extent cx="5943600" cy="3801110"/>
+            <wp:effectExtent l="0" t="0" r="0" b="8890"/>
+            <wp:docPr id="800905825" name="Picture 1"/>
+            <wp:cNvGraphicFramePr>
+              <a:graphicFrameLocks xmlns:a="http://schemas.openxmlformats.org/drawingml/2006/main" noChangeAspect="1"/>
+            </wp:cNvGraphicFramePr>
+            <a:graphic xmlns:a="http://schemas.openxmlformats.org/drawingml/2006/main">
+              <a:graphicData uri="http://schemas.openxmlformats.org/drawingml/2006/picture">
+                <pic:pic xmlns:pic="http://schemas.openxmlformats.org/drawingml/2006/picture">
+                  <pic:nvPicPr>
+                    <pic:cNvPr id="800905825" name=""/>
+                    <pic:cNvPicPr/>
+                  </pic:nvPicPr>
+                  <pic:blipFill>
+                    <a:blip r:embed="rId5"/>
+                    <a:stretch>
+                      <a:fillRect/>
+                    </a:stretch>
+                  </pic:blipFill>
+                  <pic:spPr>
+                    <a:xfrm>
+                      <a:off x="0" y="0"/>
+                      <a:ext cx="5943600" cy="3801110"/>
+                    </a:xfrm>
+                    <a:prstGeom prst="rect">
+                      <a:avLst/>
+                    </a:prstGeom>
+                  </pic:spPr>
+                </pic:pic>
+              </a:graphicData>
+            </a:graphic>
+          </wp:inline>
+        </w:drawing>
+      </w:r>
+      <w:r>
+        <w:rPr>
+          <w:noProof/>
+        </w:rPr>
+        <w:drawing>
+          <wp:inline distT="0" distB="0" distL="0" distR="0" wp14:anchorId="4FC78434" wp14:editId="3FB90CDC">
+            <wp:extent cx="5943600" cy="3801110"/>
+            <wp:effectExtent l="0" t="0" r="0" b="8890"/>
+            <wp:docPr id="1908557016" name="Picture 1"/>
+            <wp:cNvGraphicFramePr>
+              <a:graphicFrameLocks xmlns:a="http://schemas.openxmlformats.org/drawingml/2006/main" noChangeAspect="1"/>
+            </wp:cNvGraphicFramePr>
+            <a:graphic xmlns:a="http://schemas.openxmlformats.org/drawingml/2006/main">
+              <a:graphicData uri="http://schemas.openxmlformats.org/drawingml/2006/picture">
+                <pic:pic xmlns:pic="http://schemas.openxmlformats.org/drawingml/2006/picture">
+                  <pic:nvPicPr>
+                    <pic:cNvPr id="1908557016" name=""/>
+                    <pic:cNvPicPr/>
+                  </pic:nvPicPr>
+                  <pic:blipFill>
+                    <a:blip r:embed="rId5"/>
+                    <a:stretch>
+                      <a:fillRect/>
+                    </a:stretch>
+                  </pic:blipFill>
+                  <pic:spPr>
+                    <a:xfrm>
+                      <a:off x="0" y="0"/>
+                      <a:ext cx="5943600" cy="3801110"/>
+                    </a:xfrm>
+                    <a:prstGeom prst="rect">
+                      <a:avLst/>
+                    </a:prstGeom>
+                  </pic:spPr>
+                </pic:pic>
+              </a:graphicData>
+            </a:graphic>
+          </wp:inline>
+        </w:drawing>
+      </w:r>
+      <w:r>
+        <w:rPr>
+          <w:noProof/>
+        </w:rPr>
+        <w:lastRenderedPageBreak/>
+        <w:drawing>
+          <wp:inline distT="0" distB="0" distL="0" distR="0" wp14:anchorId="3B408BE6" wp14:editId="19D6A213">
+            <wp:extent cx="5943600" cy="3801110"/>
+            <wp:effectExtent l="0" t="0" r="0" b="8890"/>
+            <wp:docPr id="221024834" name="Picture 1"/>
+            <wp:cNvGraphicFramePr>
+              <a:graphicFrameLocks xmlns:a="http://schemas.openxmlformats.org/drawingml/2006/main" noChangeAspect="1"/>
+            </wp:cNvGraphicFramePr>
+            <a:graphic xmlns:a="http://schemas.openxmlformats.org/drawingml/2006/main">
+              <a:graphicData uri="http://schemas.openxmlformats.org/drawingml/2006/picture">
+                <pic:pic xmlns:pic="http://schemas.openxmlformats.org/drawingml/2006/picture">
+                  <pic:nvPicPr>
+                    <pic:cNvPr id="221024834" name=""/>
+                    <pic:cNvPicPr/>
+                  </pic:nvPicPr>
+                  <pic:blipFill>
+                    <a:blip r:embed="rId5"/>
+                    <a:stretch>
+                      <a:fillRect/>
+                    </a:stretch>
+                  </pic:blipFill>
+                  <pic:spPr>
+                    <a:xfrm>
+                      <a:off x="0" y="0"/>
+                      <a:ext cx="5943600" cy="3801110"/>
+                    </a:xfrm>
+                    <a:prstGeom prst="rect">
+                      <a:avLst/>
+                    </a:prstGeom>
+                  </pic:spPr>
+                </pic:pic>
+              </a:graphicData>
+            </a:graphic>
+          </wp:inline>
+        </w:drawing>
+      </w:r>
+      <w:r>
+        <w:rPr>
+          <w:noProof/>
+        </w:rPr>
+        <w:drawing>
+          <wp:inline distT="0" distB="0" distL="0" distR="0" wp14:anchorId="6A7625AD" wp14:editId="2E1B97CA">
+            <wp:extent cx="5943600" cy="3801110"/>
+            <wp:effectExtent l="0" t="0" r="0" b="8890"/>
+            <wp:docPr id="1762294278" name="Picture 1"/>
+            <wp:cNvGraphicFramePr>
+              <a:graphicFrameLocks xmlns:a="http://schemas.openxmlformats.org/drawingml/2006/main" noChangeAspect="1"/>
+            </wp:cNvGraphicFramePr>
+            <a:graphic xmlns:a="http://schemas.openxmlformats.org/drawingml/2006/main">
+              <a:graphicData uri="http://schemas.openxmlformats.org/drawingml/2006/picture">
+                <pic:pic xmlns:pic="http://schemas.openxmlformats.org/drawingml/2006/picture">
+                  <pic:nvPicPr>
+                    <pic:cNvPr id="1762294278" name=""/>
+                    <pic:cNvPicPr/>
+                  </pic:nvPicPr>
+                  <pic:blipFill>
+                    <a:blip r:embed="rId5"/>
+                    <a:stretch>
+                      <a:fillRect/>
+                    </a:stretch>
+                  </pic:blipFill>
+                  <pic:spPr>
+                    <a:xfrm>
+                      <a:off x="0" y="0"/>
+                      <a:ext cx="5943600" cy="3801110"/>
+                    </a:xfrm>
+                    <a:prstGeom prst="rect">
+                      <a:avLst/>
+                    </a:prstGeom>
+                  </pic:spPr>
+                </pic:pic>
+              </a:graphicData>
+            </a:graphic>
+          </wp:inline>
+        </w:drawing>
+      </w:r>
+      <w:r>
+        <w:rPr>
+          <w:noProof/>
+        </w:rPr>
+        <w:lastRenderedPageBreak/>
+        <w:drawing>
+          <wp:inline distT="0" distB="0" distL="0" distR="0" wp14:anchorId="4A59E909" wp14:editId="572AA385">
+            <wp:extent cx="5943600" cy="3801110"/>
+            <wp:effectExtent l="0" t="0" r="0" b="8890"/>
+            <wp:docPr id="1606708299" name="Picture 1"/>
+            <wp:cNvGraphicFramePr>
+              <a:graphicFrameLocks xmlns:a="http://schemas.openxmlformats.org/drawingml/2006/main" noChangeAspect="1"/>
+            </wp:cNvGraphicFramePr>
+            <a:graphic xmlns:a="http://schemas.openxmlformats.org/drawingml/2006/main">
+              <a:graphicData uri="http://schemas.openxmlformats.org/drawingml/2006/picture">
+                <pic:pic xmlns:pic="http://schemas.openxmlformats.org/drawingml/2006/picture">
+                  <pic:nvPicPr>
+                    <pic:cNvPr id="1606708299" name=""/>
+                    <pic:cNvPicPr/>
+                  </pic:nvPicPr>
+                  <pic:blipFill>
+                    <a:blip r:embed="rId5"/>
+                    <a:stretch>
+                      <a:fillRect/>
+                    </a:stretch>
+                  </pic:blipFill>
+                  <pic:spPr>
+                    <a:xfrm>
+                      <a:off x="0" y="0"/>
+                      <a:ext cx="5943600" cy="3801110"/>
+                    </a:xfrm>
+                    <a:prstGeom prst="rect">
+                      <a:avLst/>
+                    </a:prstGeom>
+                  </pic:spPr>
+                </pic:pic>
+              </a:graphicData>
+            </a:graphic>
+          </wp:inline>
+        </w:drawing>
+      </w:r>
+      <w:r>
+        <w:rPr>
+          <w:noProof/>
+        </w:rPr>
+        <w:drawing>
+          <wp:inline distT="0" distB="0" distL="0" distR="0" wp14:anchorId="014D2A32" wp14:editId="6CB80755">
+            <wp:extent cx="5943600" cy="3801110"/>
+            <wp:effectExtent l="0" t="0" r="0" b="8890"/>
+            <wp:docPr id="103050300" name="Picture 1"/>
+            <wp:cNvGraphicFramePr>
+              <a:graphicFrameLocks xmlns:a="http://schemas.openxmlformats.org/drawingml/2006/main" noChangeAspect="1"/>
+            </wp:cNvGraphicFramePr>
+            <a:graphic xmlns:a="http://schemas.openxmlformats.org/drawingml/2006/main">
+              <a:graphicData uri="http://schemas.openxmlformats.org/drawingml/2006/picture">
+                <pic:pic xmlns:pic="http://schemas.openxmlformats.org/drawingml/2006/picture">
+                  <pic:nvPicPr>
+                    <pic:cNvPr id="103050300" name=""/>
+                    <pic:cNvPicPr/>
+                  </pic:nvPicPr>
+                  <pic:blipFill>
+                    <a:blip r:embed="rId5"/>
+                    <a:stretch>
+                      <a:fillRect/>
+                    </a:stretch>
+                  </pic:blipFill>
+                  <pic:spPr>
+                    <a:xfrm>
+                      <a:off x="0" y="0"/>
+                      <a:ext cx="5943600" cy="3801110"/>
+                    </a:xfrm>
+                    <a:prstGeom prst="rect">
+                      <a:avLst/>
+                    </a:prstGeom>
+                  </pic:spPr>
+                </pic:pic>
+              </a:graphicData>
+            </a:graphic>
+          </wp:inline>
+        </w:drawing>
+      </w:r>
+      <w:r>
+        <w:rPr>
+          <w:noProof/>
+        </w:rPr>
+        <w:lastRenderedPageBreak/>
+        <w:drawing>
+          <wp:inline distT="0" distB="0" distL="0" distR="0" wp14:anchorId="468FA1F7" wp14:editId="31F13EA1">
+            <wp:extent cx="5943600" cy="3801110"/>
+            <wp:effectExtent l="0" t="0" r="0" b="8890"/>
+            <wp:docPr id="1207247983" name="Picture 1"/>
+            <wp:cNvGraphicFramePr>
+              <a:graphicFrameLocks xmlns:a="http://schemas.openxmlformats.org/drawingml/2006/main" noChangeAspect="1"/>
+            </wp:cNvGraphicFramePr>
+            <a:graphic xmlns:a="http://schemas.openxmlformats.org/drawingml/2006/main">
+              <a:graphicData uri="http://schemas.openxmlformats.org/drawingml/2006/picture">
+                <pic:pic xmlns:pic="http://schemas.openxmlformats.org/drawingml/2006/picture">
+                  <pic:nvPicPr>
+                    <pic:cNvPr id="1207247983" name=""/>
+                    <pic:cNvPicPr/>
+                  </pic:nvPicPr>
+                  <pic:blipFill>
+                    <a:blip r:embed="rId5"/>
+                    <a:stretch>
+                      <a:fillRect/>
+                    </a:stretch>
+                  </pic:blipFill>
+                  <pic:spPr>
+                    <a:xfrm>
+                      <a:off x="0" y="0"/>
+                      <a:ext cx="5943600" cy="3801110"/>
+                    </a:xfrm>
+                    <a:prstGeom prst="rect">
+                      <a:avLst/>
+                    </a:prstGeom>
+                  </pic:spPr>
+                </pic:pic>
+              </a:graphicData>
+            </a:graphic>
+          </wp:inline>
+        </w:drawing>
+      </w:r>
+      <w:r>
+        <w:rPr>
+          <w:noProof/>
+        </w:rPr>
+        <w:drawing>
+          <wp:inline distT="0" distB="0" distL="0" distR="0" wp14:anchorId="15629E01" wp14:editId="04536232">
+            <wp:extent cx="5943600" cy="3801110"/>
+            <wp:effectExtent l="0" t="0" r="0" b="8890"/>
+            <wp:docPr id="537372168" name="Picture 1"/>
+            <wp:cNvGraphicFramePr>
+              <a:graphicFrameLocks xmlns:a="http://schemas.openxmlformats.org/drawingml/2006/main" noChangeAspect="1"/>
+            </wp:cNvGraphicFramePr>
+            <a:graphic xmlns:a="http://schemas.openxmlformats.org/drawingml/2006/main">
+              <a:graphicData uri="http://schemas.openxmlformats.org/drawingml/2006/picture">
+                <pic:pic xmlns:pic="http://schemas.openxmlformats.org/drawingml/2006/picture">
+                  <pic:nvPicPr>
+                    <pic:cNvPr id="537372168" name=""/>
+                    <pic:cNvPicPr/>
+                  </pic:nvPicPr>
+                  <pic:blipFill>
+                    <a:blip r:embed="rId5"/>
+                    <a:stretch>
+                      <a:fillRect/>
+                    </a:stretch>
+                  </pic:blipFill>
+                  <pic:spPr>
+                    <a:xfrm>
+                      <a:off x="0" y="0"/>
+                      <a:ext cx="5943600" cy="3801110"/>
+                    </a:xfrm>
+                    <a:prstGeom prst="rect">
+                      <a:avLst/>
+                    </a:prstGeom>
+                  </pic:spPr>
+                </pic:pic>
+              </a:graphicData>
+            </a:graphic>
+          </wp:inline>
+        </w:drawing>
+      </w:r>
+      <w:r>
+        <w:rPr>
+          <w:noProof/>
+        </w:rPr>
+        <w:lastRenderedPageBreak/>
+        <w:drawing>
+          <wp:inline distT="0" distB="0" distL="0" distR="0" wp14:anchorId="0B9A8574" wp14:editId="46B4EB15">
+            <wp:extent cx="5943600" cy="3801110"/>
+            <wp:effectExtent l="0" t="0" r="0" b="8890"/>
+            <wp:docPr id="121520972" name="Picture 1"/>
+            <wp:cNvGraphicFramePr>
+              <a:graphicFrameLocks xmlns:a="http://schemas.openxmlformats.org/drawingml/2006/main" noChangeAspect="1"/>
+            </wp:cNvGraphicFramePr>
+            <a:graphic xmlns:a="http://schemas.openxmlformats.org/drawingml/2006/main">
+              <a:graphicData uri="http://schemas.openxmlformats.org/drawingml/2006/picture">
+                <pic:pic xmlns:pic="http://schemas.openxmlformats.org/drawingml/2006/picture">
+                  <pic:nvPicPr>
+                    <pic:cNvPr id="121520972" name=""/>
+                    <pic:cNvPicPr/>
+                  </pic:nvPicPr>
+                  <pic:blipFill>
+                    <a:blip r:embed="rId5"/>
+                    <a:stretch>
+                      <a:fillRect/>
+                    </a:stretch>
+                  </pic:blipFill>
+                  <pic:spPr>
+                    <a:xfrm>
+                      <a:off x="0" y="0"/>
+                      <a:ext cx="5943600" cy="3801110"/>
+                    </a:xfrm>
+                    <a:prstGeom prst="rect">
+                      <a:avLst/>
+                    </a:prstGeom>
+                  </pic:spPr>
+                </pic:pic>
+              </a:graphicData>
+            </a:graphic>
+          </wp:inline>
+        </w:drawing>
+      </w:r>
+      <w:r>
+        <w:rPr>
+          <w:noProof/>
+        </w:rPr>
+        <w:drawing>
+          <wp:inline distT="0" distB="0" distL="0" distR="0" wp14:anchorId="37B2D552" wp14:editId="5A630195">
+            <wp:extent cx="5943600" cy="3801110"/>
+            <wp:effectExtent l="0" t="0" r="0" b="8890"/>
+            <wp:docPr id="1784138564" name="Picture 1"/>
+            <wp:cNvGraphicFramePr>
+              <a:graphicFrameLocks xmlns:a="http://schemas.openxmlformats.org/drawingml/2006/main" noChangeAspect="1"/>
+            </wp:cNvGraphicFramePr>
+            <a:graphic xmlns:a="http://schemas.openxmlformats.org/drawingml/2006/main">
+              <a:graphicData uri="http://schemas.openxmlformats.org/drawingml/2006/picture">
+                <pic:pic xmlns:pic="http://schemas.openxmlformats.org/drawingml/2006/picture">
+                  <pic:nvPicPr>
+                    <pic:cNvPr id="1784138564" name=""/>
+                    <pic:cNvPicPr/>
+                  </pic:nvPicPr>
+                  <pic:blipFill>
+                    <a:blip r:embed="rId5"/>
+                    <a:stretch>
+                      <a:fillRect/>
+                    </a:stretch>
+                  </pic:blipFill>
+                  <pic:spPr>
+                    <a:xfrm>
+                      <a:off x="0" y="0"/>
+                      <a:ext cx="5943600" cy="3801110"/>
+                    </a:xfrm>
+                    <a:prstGeom prst="rect">
+                      <a:avLst/>
+                    </a:prstGeom>
+                  </pic:spPr>
+                </pic:pic>
+              </a:graphicData>
+            </a:graphic>
+          </wp:inline>
+        </w:drawing>
+      </w:r>
+      <w:r>
+        <w:rPr>
+          <w:noProof/>
+        </w:rPr>
+        <w:lastRenderedPageBreak/>
+        <w:drawing>
+          <wp:inline distT="0" distB="0" distL="0" distR="0" wp14:anchorId="48975D36" wp14:editId="5224801B">
+            <wp:extent cx="5943600" cy="3801110"/>
+            <wp:effectExtent l="0" t="0" r="0" b="8890"/>
+            <wp:docPr id="1121239433" name="Picture 1"/>
+            <wp:cNvGraphicFramePr>
+              <a:graphicFrameLocks xmlns:a="http://schemas.openxmlformats.org/drawingml/2006/main" noChangeAspect="1"/>
+            </wp:cNvGraphicFramePr>
+            <a:graphic xmlns:a="http://schemas.openxmlformats.org/drawingml/2006/main">
+              <a:graphicData uri="http://schemas.openxmlformats.org/drawingml/2006/picture">
+                <pic:pic xmlns:pic="http://schemas.openxmlformats.org/drawingml/2006/picture">
+                  <pic:nvPicPr>
+                    <pic:cNvPr id="1121239433" name=""/>
+                    <pic:cNvPicPr/>
+                  </pic:nvPicPr>
+                  <pic:blipFill>
+                    <a:blip r:embed="rId5"/>
+                    <a:stretch>
+                      <a:fillRect/>
+                    </a:stretch>
+                  </pic:blipFill>
+                  <pic:spPr>
+                    <a:xfrm>
+                      <a:off x="0" y="0"/>
+                      <a:ext cx="5943600" cy="3801110"/>
+                    </a:xfrm>
+                    <a:prstGeom prst="rect">
+                      <a:avLst/>
+                    </a:prstGeom>
+                  </pic:spPr>
+                </pic:pic>
+              </a:graphicData>
+            </a:graphic>
+          </wp:inline>
+        </w:drawing>
+      </w:r>
+      <w:r>
+        <w:rPr>
+          <w:noProof/>
+        </w:rPr>
+        <w:drawing>
+          <wp:inline distT="0" distB="0" distL="0" distR="0" wp14:anchorId="4CF31BF8" wp14:editId="3D591814">
+            <wp:extent cx="5943600" cy="3801110"/>
+            <wp:effectExtent l="0" t="0" r="0" b="8890"/>
+            <wp:docPr id="1533428522" name="Picture 1"/>
+            <wp:cNvGraphicFramePr>
+              <a:graphicFrameLocks xmlns:a="http://schemas.openxmlformats.org/drawingml/2006/main" noChangeAspect="1"/>
+            </wp:cNvGraphicFramePr>
+            <a:graphic xmlns:a="http://schemas.openxmlformats.org/drawingml/2006/main">
+              <a:graphicData uri="http://schemas.openxmlformats.org/drawingml/2006/picture">
+                <pic:pic xmlns:pic="http://schemas.openxmlformats.org/drawingml/2006/picture">
+                  <pic:nvPicPr>
+                    <pic:cNvPr id="1533428522" name=""/>
+                    <pic:cNvPicPr/>
+                  </pic:nvPicPr>
+                  <pic:blipFill>
+                    <a:blip r:embed="rId5"/>
+                    <a:stretch>
+                      <a:fillRect/>
+                    </a:stretch>
+                  </pic:blipFill>
+                  <pic:spPr>
+                    <a:xfrm>
+                      <a:off x="0" y="0"/>
+                      <a:ext cx="5943600" cy="3801110"/>
+                    </a:xfrm>
+                    <a:prstGeom prst="rect">
+                      <a:avLst/>
+                    </a:prstGeom>
+                  </pic:spPr>
+                </pic:pic>
+              </a:graphicData>
+            </a:graphic>
+          </wp:inline>
+        </w:drawing>
+      </w:r>
+      <w:r>
+        <w:rPr>
+          <w:noProof/>
+        </w:rPr>
+        <w:lastRenderedPageBreak/>
+        <w:drawing>
+          <wp:inline distT="0" distB="0" distL="0" distR="0" wp14:anchorId="69F6A2C8" wp14:editId="45CCE99F">
+            <wp:extent cx="5943600" cy="3801110"/>
+            <wp:effectExtent l="0" t="0" r="0" b="8890"/>
+            <wp:docPr id="2031245554" name="Picture 1"/>
+            <wp:cNvGraphicFramePr>
+              <a:graphicFrameLocks xmlns:a="http://schemas.openxmlformats.org/drawingml/2006/main" noChangeAspect="1"/>
+            </wp:cNvGraphicFramePr>
+            <a:graphic xmlns:a="http://schemas.openxmlformats.org/drawingml/2006/main">
+              <a:graphicData uri="http://schemas.openxmlformats.org/drawingml/2006/picture">
+                <pic:pic xmlns:pic="http://schemas.openxmlformats.org/drawingml/2006/picture">
+                  <pic:nvPicPr>
+                    <pic:cNvPr id="2031245554" name=""/>
+                    <pic:cNvPicPr/>
+                  </pic:nvPicPr>
+                  <pic:blipFill>
+                    <a:blip r:embed="rId5"/>
+                    <a:stretch>
+                      <a:fillRect/>
+                    </a:stretch>
+                  </pic:blipFill>
+                  <pic:spPr>
+                    <a:xfrm>
+                      <a:off x="0" y="0"/>
+                      <a:ext cx="5943600" cy="3801110"/>
+                    </a:xfrm>
+                    <a:prstGeom prst="rect">
+                      <a:avLst/>
+                    </a:prstGeom>
+                  </pic:spPr>
+                </pic:pic>
+              </a:graphicData>
+            </a:graphic>
+          </wp:inline>
+        </w:drawing>
+      </w:r>
+      <w:r>
+        <w:rPr>
+          <w:noProof/>
+        </w:rPr>
+        <w:drawing>
+          <wp:inline distT="0" distB="0" distL="0" distR="0" wp14:anchorId="72CEACE3" wp14:editId="4852492F">
+            <wp:extent cx="5943600" cy="3801110"/>
+            <wp:effectExtent l="0" t="0" r="0" b="8890"/>
+            <wp:docPr id="158443974" name="Picture 1"/>
+            <wp:cNvGraphicFramePr>
+              <a:graphicFrameLocks xmlns:a="http://schemas.openxmlformats.org/drawingml/2006/main" noChangeAspect="1"/>
+            </wp:cNvGraphicFramePr>
+            <a:graphic xmlns:a="http://schemas.openxmlformats.org/drawingml/2006/main">
+              <a:graphicData uri="http://schemas.openxmlformats.org/drawingml/2006/picture">
+                <pic:pic xmlns:pic="http://schemas.openxmlformats.org/drawingml/2006/picture">
+                  <pic:nvPicPr>
+                    <pic:cNvPr id="158443974" name=""/>
+                    <pic:cNvPicPr/>
+                  </pic:nvPicPr>
+                  <pic:blipFill>
+                    <a:blip r:embed="rId5"/>
+                    <a:stretch>
+                      <a:fillRect/>
+                    </a:stretch>
+                  </pic:blipFill>
+                  <pic:spPr>
+                    <a:xfrm>
+                      <a:off x="0" y="0"/>
+                      <a:ext cx="5943600" cy="3801110"/>
+                    </a:xfrm>
+                    <a:prstGeom prst="rect">
+                      <a:avLst/>
+                    </a:prstGeom>
+                  </pic:spPr>
+                </pic:pic>
+              </a:graphicData>
+            </a:graphic>
+          </wp:inline>
+        </w:drawing>
+      </w:r>
+      <w:r>
+        <w:rPr>
+          <w:noProof/>
+        </w:rPr>
+        <w:lastRenderedPageBreak/>
+        <w:drawing>
+          <wp:inline distT="0" distB="0" distL="0" distR="0" wp14:anchorId="439826F2" wp14:editId="604B156E">
+            <wp:extent cx="5943600" cy="3801110"/>
+            <wp:effectExtent l="0" t="0" r="0" b="8890"/>
+            <wp:docPr id="811546842" name="Picture 1"/>
+            <wp:cNvGraphicFramePr>
+              <a:graphicFrameLocks xmlns:a="http://schemas.openxmlformats.org/drawingml/2006/main" noChangeAspect="1"/>
+            </wp:cNvGraphicFramePr>
+            <a:graphic xmlns:a="http://schemas.openxmlformats.org/drawingml/2006/main">
+              <a:graphicData uri="http://schemas.openxmlformats.org/drawingml/2006/picture">
+                <pic:pic xmlns:pic="http://schemas.openxmlformats.org/drawingml/2006/picture">
+                  <pic:nvPicPr>
+                    <pic:cNvPr id="811546842" name=""/>
+                    <pic:cNvPicPr/>
+                  </pic:nvPicPr>
+                  <pic:blipFill>
+                    <a:blip r:embed="rId5"/>
+                    <a:stretch>
+                      <a:fillRect/>
+                    </a:stretch>
+                  </pic:blipFill>
+                  <pic:spPr>
+                    <a:xfrm>
+                      <a:off x="0" y="0"/>
+                      <a:ext cx="5943600" cy="3801110"/>
+                    </a:xfrm>
+                    <a:prstGeom prst="rect">
+                      <a:avLst/>
+                    </a:prstGeom>
+                  </pic:spPr>
+                </pic:pic>
+              </a:graphicData>
+            </a:graphic>
+          </wp:inline>
+        </w:drawing>
+      </w:r>
+      <w:r>
+        <w:rPr>
+          <w:noProof/>
+        </w:rPr>
+        <w:drawing>
+          <wp:inline distT="0" distB="0" distL="0" distR="0" wp14:anchorId="5C529EBF" wp14:editId="1EA6945D">
+            <wp:extent cx="5943600" cy="3801110"/>
+            <wp:effectExtent l="0" t="0" r="0" b="8890"/>
+            <wp:docPr id="849572163" name="Picture 1"/>
+            <wp:cNvGraphicFramePr>
+              <a:graphicFrameLocks xmlns:a="http://schemas.openxmlformats.org/drawingml/2006/main" noChangeAspect="1"/>
+            </wp:cNvGraphicFramePr>
+            <a:graphic xmlns:a="http://schemas.openxmlformats.org/drawingml/2006/main">
+              <a:graphicData uri="http://schemas.openxmlformats.org/drawingml/2006/picture">
+                <pic:pic xmlns:pic="http://schemas.openxmlformats.org/drawingml/2006/picture">
+                  <pic:nvPicPr>
+                    <pic:cNvPr id="849572163" name=""/>
+                    <pic:cNvPicPr/>
+                  </pic:nvPicPr>
+                  <pic:blipFill>
+                    <a:blip r:embed="rId5"/>
+                    <a:stretch>
+                      <a:fillRect/>
+                    </a:stretch>
+                  </pic:blipFill>
+                  <pic:spPr>
+                    <a:xfrm>
+                      <a:off x="0" y="0"/>
+                      <a:ext cx="5943600" cy="3801110"/>
+                    </a:xfrm>
+                    <a:prstGeom prst="rect">
+                      <a:avLst/>
+                    </a:prstGeom>
+                  </pic:spPr>
+                </pic:pic>
+              </a:graphicData>
+            </a:graphic>
+          </wp:inline>
+        </w:drawing>
+      </w:r>
+      <w:r>
+        <w:rPr>
+          <w:noProof/>
+        </w:rPr>
+        <w:lastRenderedPageBreak/>
+        <w:drawing>
+          <wp:inline distT="0" distB="0" distL="0" distR="0" wp14:anchorId="30F60A84" wp14:editId="75AF2000">
+            <wp:extent cx="5943600" cy="3801110"/>
+            <wp:effectExtent l="0" t="0" r="0" b="8890"/>
+            <wp:docPr id="187468585" name="Picture 1"/>
+            <wp:cNvGraphicFramePr>
+              <a:graphicFrameLocks xmlns:a="http://schemas.openxmlformats.org/drawingml/2006/main" noChangeAspect="1"/>
+            </wp:cNvGraphicFramePr>
+            <a:graphic xmlns:a="http://schemas.openxmlformats.org/drawingml/2006/main">
+              <a:graphicData uri="http://schemas.openxmlformats.org/drawingml/2006/picture">
+                <pic:pic xmlns:pic="http://schemas.openxmlformats.org/drawingml/2006/picture">
+                  <pic:nvPicPr>
+                    <pic:cNvPr id="187468585" name=""/>
+                    <pic:cNvPicPr/>
+                  </pic:nvPicPr>
+                  <pic:blipFill>
+                    <a:blip r:embed="rId5"/>
+                    <a:stretch>
+                      <a:fillRect/>
+                    </a:stretch>
+                  </pic:blipFill>
+                  <pic:spPr>
+                    <a:xfrm>
+                      <a:off x="0" y="0"/>
+                      <a:ext cx="5943600" cy="3801110"/>
+                    </a:xfrm>
+                    <a:prstGeom prst="rect">
+                      <a:avLst/>
+                    </a:prstGeom>
+                  </pic:spPr>
+                </pic:pic>
+              </a:graphicData>
+            </a:graphic>
+          </wp:inline>
+        </w:drawing>
+      </w:r>
+      <w:r>
+        <w:rPr>
+          <w:noProof/>
+        </w:rPr>
+        <w:drawing>
+          <wp:inline distT="0" distB="0" distL="0" distR="0" wp14:anchorId="27D189A3" wp14:editId="595F34B8">
+            <wp:extent cx="5943600" cy="3801110"/>
+            <wp:effectExtent l="0" t="0" r="0" b="8890"/>
+            <wp:docPr id="288819489" name="Picture 1"/>
+            <wp:cNvGraphicFramePr>
+              <a:graphicFrameLocks xmlns:a="http://schemas.openxmlformats.org/drawingml/2006/main" noChangeAspect="1"/>
+            </wp:cNvGraphicFramePr>
+            <a:graphic xmlns:a="http://schemas.openxmlformats.org/drawingml/2006/main">
+              <a:graphicData uri="http://schemas.openxmlformats.org/drawingml/2006/picture">
+                <pic:pic xmlns:pic="http://schemas.openxmlformats.org/drawingml/2006/picture">
+                  <pic:nvPicPr>
+                    <pic:cNvPr id="288819489" name=""/>
+                    <pic:cNvPicPr/>
+                  </pic:nvPicPr>
+                  <pic:blipFill>
+                    <a:blip r:embed="rId5"/>
+                    <a:stretch>
+                      <a:fillRect/>
+                    </a:stretch>
+                  </pic:blipFill>
+                  <pic:spPr>
+                    <a:xfrm>
+                      <a:off x="0" y="0"/>
+                      <a:ext cx="5943600" cy="3801110"/>
+                    </a:xfrm>
+                    <a:prstGeom prst="rect">
+                      <a:avLst/>
+                    </a:prstGeom>
+                  </pic:spPr>
+                </pic:pic>
+              </a:graphicData>
+            </a:graphic>
+          </wp:inline>
+        </w:drawing>
+      </w:r>
+      <w:r>
+        <w:rPr>
+          <w:noProof/>
+        </w:rPr>
+        <w:lastRenderedPageBreak/>
+        <w:drawing>
+          <wp:inline distT="0" distB="0" distL="0" distR="0" wp14:anchorId="609073E2" wp14:editId="31CC66E1">
+            <wp:extent cx="5943600" cy="3801110"/>
+            <wp:effectExtent l="0" t="0" r="0" b="8890"/>
+            <wp:docPr id="94697309" name="Picture 1"/>
+            <wp:cNvGraphicFramePr>
+              <a:graphicFrameLocks xmlns:a="http://schemas.openxmlformats.org/drawingml/2006/main" noChangeAspect="1"/>
+            </wp:cNvGraphicFramePr>
+            <a:graphic xmlns:a="http://schemas.openxmlformats.org/drawingml/2006/main">
+              <a:graphicData uri="http://schemas.openxmlformats.org/drawingml/2006/picture">
+                <pic:pic xmlns:pic="http://schemas.openxmlformats.org/drawingml/2006/picture">
+                  <pic:nvPicPr>
+                    <pic:cNvPr id="94697309" name=""/>
+                    <pic:cNvPicPr/>
+                  </pic:nvPicPr>
+                  <pic:blipFill>
+                    <a:blip r:embed="rId5"/>
+                    <a:stretch>
+                      <a:fillRect/>
+                    </a:stretch>
+                  </pic:blipFill>
+                  <pic:spPr>
+                    <a:xfrm>
+                      <a:off x="0" y="0"/>
+                      <a:ext cx="5943600" cy="3801110"/>
+                    </a:xfrm>
+                    <a:prstGeom prst="rect">
+                      <a:avLst/>
+                    </a:prstGeom>
+                  </pic:spPr>
+                </pic:pic>
+              </a:graphicData>
+            </a:graphic>
+          </wp:inline>
+        </w:drawing>
+      </w:r>
+      <w:r>
+        <w:rPr>
+          <w:noProof/>
+        </w:rPr>
+        <w:drawing>
+          <wp:inline distT="0" distB="0" distL="0" distR="0" wp14:anchorId="180297E9" wp14:editId="66FD18A7">
+            <wp:extent cx="5943600" cy="3801110"/>
+            <wp:effectExtent l="0" t="0" r="0" b="8890"/>
+            <wp:docPr id="1127477080" name="Picture 1"/>
+            <wp:cNvGraphicFramePr>
+              <a:graphicFrameLocks xmlns:a="http://schemas.openxmlformats.org/drawingml/2006/main" noChangeAspect="1"/>
+            </wp:cNvGraphicFramePr>
+            <a:graphic xmlns:a="http://schemas.openxmlformats.org/drawingml/2006/main">
+              <a:graphicData uri="http://schemas.openxmlformats.org/drawingml/2006/picture">
+                <pic:pic xmlns:pic="http://schemas.openxmlformats.org/drawingml/2006/picture">
+                  <pic:nvPicPr>
+                    <pic:cNvPr id="1127477080" name=""/>
+                    <pic:cNvPicPr/>
+                  </pic:nvPicPr>
+                  <pic:blipFill>
+                    <a:blip r:embed="rId5"/>
+                    <a:stretch>
+                      <a:fillRect/>
+                    </a:stretch>
+                  </pic:blipFill>
+                  <pic:spPr>
+                    <a:xfrm>
+                      <a:off x="0" y="0"/>
+                      <a:ext cx="5943600" cy="3801110"/>
+                    </a:xfrm>
+                    <a:prstGeom prst="rect">
+                      <a:avLst/>
+                    </a:prstGeom>
+                  </pic:spPr>
+                </pic:pic>
+              </a:graphicData>
+            </a:graphic>
+          </wp:inline>
+        </w:drawing>
+      </w:r>
+      <w:r>
+        <w:br w:type="page"/>
+      </w:r>
+    </w:p>
+    <w:p>
+      <w:r>
+        <w:lastRenderedPageBreak/>
+        <w:t>TOP SECRET FILE</w:t>
+      </w:r>
+    </w:p>
+    <w:p>
+      <w:r>
+        <w:rPr>
+          <w:noProof/>
+        </w:rPr>
+        <w:drawing>
+          <wp:inline distT="0" distB="0" distL="0" distR="0" wp14:anchorId="4F2F165A" wp14:editId="49C453C1">
+            <wp:extent cx="5943600" cy="3801110"/>
+            <wp:effectExtent l="0" t="0" r="0" b="8890"/>
+            <wp:docPr id="1638211873" name="Picture 1"/>
+            <wp:cNvGraphicFramePr>
+              <a:graphicFrameLocks xmlns:a="http://schemas.openxmlformats.org/drawingml/2006/main" noChangeAspect="1"/>
+            </wp:cNvGraphicFramePr>
+            <a:graphic xmlns:a="http://schemas.openxmlformats.org/drawingml/2006/main">
+              <a:graphicData uri="http://schemas.openxmlformats.org/drawingml/2006/picture">
+                <pic:pic xmlns:pic="http://schemas.openxmlformats.org/drawingml/2006/picture">
+                  <pic:nvPicPr>
+                    <pic:cNvPr id="1638211873" name=""/>
+                    <pic:cNvPicPr/>
+                  </pic:nvPicPr>
+                  <pic:blipFill>
+                    <a:blip r:embed="rId5"/>
+                    <a:stretch>
+                      <a:fillRect/>
+                    </a:stretch>
+                  </pic:blipFill>
+                  <pic:spPr>
+                    <a:xfrm>
+                      <a:off x="0" y="0"/>
+                      <a:ext cx="5943600" cy="3801110"/>
+                    </a:xfrm>
+                    <a:prstGeom prst="rect">
+                      <a:avLst/>
+                    </a:prstGeom>
+                  </pic:spPr>
+                </pic:pic>
+              </a:graphicData>
+            </a:graphic>
+          </wp:inline>
+        </w:drawing>
+      </w:r>
+      <w:r>
+        <w:br w:type="page"/>
+      </w:r>
+    </w:p>
+    <w:p/>
+    <w:p>
+      <w:r>
+        <w:rPr>
+          <w:noProof/>
+        </w:rPr>
+        <w:drawing>
+          <wp:inline distT="0" distB="0" distL="0" distR="0" wp14:anchorId="30BCE3C3" wp14:editId="21E37781">
+            <wp:extent cx="5943600" cy="3801110"/>
+            <wp:effectExtent l="0" t="0" r="0" b="8890"/>
+            <wp:docPr id="1282595117" name="Picture 1"/>
+            <wp:cNvGraphicFramePr>
+              <a:graphicFrameLocks xmlns:a="http://schemas.openxmlformats.org/drawingml/2006/main" noChangeAspect="1"/>
+            </wp:cNvGraphicFramePr>
+            <a:graphic xmlns:a="http://schemas.openxmlformats.org/drawingml/2006/main">
+              <a:graphicData uri="http://schemas.openxmlformats.org/drawingml/2006/picture">
+                <pic:pic xmlns:pic="http://schemas.openxmlformats.org/drawingml/2006/picture">
+                  <pic:nvPicPr>
+                    <pic:cNvPr id="1282595117" name=""/>
+                    <pic:cNvPicPr/>
+                  </pic:nvPicPr>
+                  <pic:blipFill>
+                    <a:blip r:embed="rId5"/>
+                    <a:stretch>
+                      <a:fillRect/>
+                    </a:stretch>
+                  </pic:blipFill>
+                  <pic:spPr>
+                    <a:xfrm>
+                      <a:off x="0" y="0"/>
+                      <a:ext cx="5943600" cy="3801110"/>
+                    </a:xfrm>
+                    <a:prstGeom prst="rect">
+                      <a:avLst/>
+                    </a:prstGeom>
+                  </pic:spPr>
+                </pic:pic>
+              </a:graphicData>
+            </a:graphic>
+          </wp:inline>
+        </w:drawing>
+      </w:r>
+    </w:p>
+    <w:p>
+      <w:r>
+        <w:t>TOP SECRET FILE</w:t>
+      </w:r>
+    </w:p>
+    <w:p/>
+    <w:p>
+      <w:r>
+        <w:t>TOP SECRET FILE</w:t>
+      </w:r>
+    </w:p>
+    <w:p/>
+    <w:p>
+      <w:r>
+        <w:t>TOP SECRET FILE</w:t>
+      </w:r>
+    </w:p>
+    <w:p>
+      <w:r>
+        <w:br w:type="page"/>
+      </w:r>
+    </w:p>
+    <w:p>
+      <w:r>
+        <w:lastRenderedPageBreak/>
+        <w:t>TOP SECRET FILE</w:t>
+      </w:r>
+    </w:p>
+    <w:p/>
+    <w:p>
+      <w:r>
+        <w:t>TOP SECRET FILE</w:t>
+      </w:r>
+    </w:p>
+    <w:p>
+      <w:r>
+        <w:br w:type="page"/>
+      </w:r>
+    </w:p>
+    <w:p>
+      <w:r>
+        <w:lastRenderedPageBreak/>
+        <w:t>TOP SECRET FILE</w:t>
+      </w:r>
+    </w:p>
+    <w:p>
+      <w:r>
+        <w:br w:type="page"/>
+      </w:r>
+    </w:p>
+    <w:p>
+      <w:r>
+        <w:lastRenderedPageBreak/>
+        <w:t>TOP SECRET FILE</w:t>
+      </w:r>
+    </w:p>
+    <w:p/>
+    <w:p>
+      <w:r>
+        <w:t>TOP SECRET FILE</w:t>
+      </w:r>
+    </w:p>
+    <w:p>
+      <w:r>
+        <w:br w:type="page"/>
+      </w:r>
+    </w:p>
+    <w:p>
+      <w:r>
+        <w:lastRenderedPageBreak/>
+        <w:t>TOP SECRET FILE</w:t>
+      </w:r>
+    </w:p>
+    <w:p>
+      <w:r>
+        <w:br w:type="page"/>
+      </w:r>
+    </w:p>
+    <w:p>
+      <w:r>
+        <w:lastRenderedPageBreak/>
+        <w:t>TOP SECRET FILE</w:t>
+      </w:r>
+    </w:p>
+    <w:p>
+      <w:r>
+        <w:br w:type="page"/>
+      </w:r>
+    </w:p>
+    <w:p>
+      <w:r>
+        <w:lastRenderedPageBreak/>
+        <w:t>TOP SECRET FILE</w:t>
+      </w:r>
+    </w:p>
+    <w:p/>
+    <w:p>
+      <w:r>
+        <w:t>TOP SECRET FILE</w:t>
+      </w:r>
+    </w:p>
+    <w:p/>
+    <w:p>
+      <w:r>
+        <w:t>TOP SECRET FILE</w:t>
+      </w:r>
+    </w:p>
+    <w:p/>
+    <w:p>
+      <w:r>
+        <w:t>TOP SECRET FILE</w:t>
+      </w:r>
+    </w:p>
+    <w:p>
+      <w:r>
+        <w:br w:type="page"/>
+      </w:r>
+    </w:p>
+    <w:p>
+      <w:r>
+        <w:lastRenderedPageBreak/>
+        <w:t>TOP SECRET FILE</w:t>
+      </w:r>
+    </w:p>
+    <w:p/>
+    <w:p>
+      <w:r>
+        <w:t>TOP SECRET FILE</w:t>
+      </w:r>
+    </w:p>
+    <w:p/>
+    <w:p>
+      <w:r>
+        <w:t>TOP SECRET FILE</w:t>
+      </w:r>
+    </w:p>
+    <w:p>
+      <w:r>
+        <w:br w:type="page"/>
+      </w:r>
+    </w:p>
+    <w:p>
+      <w:r>
+        <w:lastRenderedPageBreak/>
+        <w:t>TOP SECRET FILE</w:t>
+      </w:r>
+    </w:p>
+    <w:p/>
+    <w:p>
+      <w:r>
+        <w:t>TOP SECRET FILE</w:t>
+      </w:r>
+    </w:p>
+    <w:p/>
+    <w:p>
+      <w:r>
+        <w:t>V</w:t>
+      </w:r>
+    </w:p>
+    <w:p>
+      <w:r>
+        <w:t>TOP SECRET FILE</w:t>
+      </w:r>
+    </w:p>
+    <w:p/>
+    <w:p>
+      <w:r>
+        <w:t>TOP SECRET FILE</w:t>
+      </w:r>
+    </w:p>
+    <w:p/>
+    <w:p>
+      <w:r>
+        <w:t>TOP SECRET FILE</w:t>
+      </w:r>
+    </w:p>
+    <w:p/>
+    <w:p>
+      <w:r>
+        <w:t>TOP SECRET FILE</w:t>
+      </w:r>
+    </w:p>
+    <w:p>
+      <w:r>
+        <w:br w:type="page"/>
+      </w:r>
+    </w:p>
+    <w:p>
+      <w:r>
+        <w:lastRenderedPageBreak/>
+        <w:t>TOP SECRET FILE</w:t>
+      </w:r>
+    </w:p>
+    <w:p/>
+    <w:p>
+      <w:r>
+        <w:t>TOP SECRET FILE</w:t>
+      </w:r>
+    </w:p>
+    <w:p/>
+    <w:p>
+      <w:r>
+        <w:t>TOP SECRET FILE</w:t>
+      </w:r>
+    </w:p>
+    <w:p/>
+    <w:p>
+      <w:r>
+        <w:t>TOP SECRET FILE</w:t>
+      </w:r>
+    </w:p>
+    <w:p/>
+    <w:p>
+      <w:r>
+        <w:t>TOP SECRET FILE</w:t>
+      </w:r>
+    </w:p>
+    <w:p/>
+    <w:p>
+      <w:r>
+        <w:t>TOP SECRET FILE</w:t>
+      </w:r>
+    </w:p>
+    <w:p/>
+    <w:p>
+      <w:r>
+        <w:t>TOP SECRET FILE</w:t>
+      </w:r>
+    </w:p>
+    <w:p>
+      <w:r>
+        <w:br w:type="page"/>
+      </w:r>
+    </w:p>
+    <w:p>
+      <w:r>
+        <w:lastRenderedPageBreak/>
+        <w:t>TOP SECRET FILE</w:t>
+      </w:r>
+    </w:p>
+    <w:p>
+      <w:r>
+        <w:br w:type="page"/>
+      </w:r>
+    </w:p>
+    <w:p>
+      <w:r>
+        <w:lastRenderedPageBreak/>
+        <w:t>TOP SECRET FILE</w:t>
+      </w:r>
+    </w:p>
+    <w:p/>
+    <w:p>
+      <w:r>
+        <w:t>TOP SECRET FILE</w:t>
+      </w:r>
+    </w:p>
+    <w:p>
+      <w:r>
+        <w:br w:type="page"/>
+      </w:r>
+    </w:p>
+    <w:p>
+      <w:r>
+        <w:lastRenderedPageBreak/>
+        <w:t>TOP SECRET FILE</w:t>
+      </w:r>
+    </w:p>
+    <w:p>
+      <w:r>
+        <w:br w:type="page"/>
+      </w:r>
+    </w:p>
+    <w:p>
+      <w:r>
+        <w:lastRenderedPageBreak/>
+        <w:t>TOP SECRET FILE</w:t>
+      </w:r>
+    </w:p>
+    <w:p>
+      <w:r>
+        <w:br w:type="page"/>
+      </w:r>
+    </w:p>
+    <w:p>
+      <w:r>
+        <w:lastRenderedPageBreak/>
+        <w:t>TOP SECRET FILE</w:t>
+      </w:r>
+    </w:p>
+    <w:p>
+      <w:r>
+        <w:br w:type="page"/>
+      </w:r>
+    </w:p>
+    <w:p>
+      <w:r>
+        <w:lastRenderedPageBreak/>
+        <w:t>TOP SECRET FILE</w:t>
+      </w:r>
+    </w:p>
+    <w:p/>
+    <w:p>
+      <w:r>
+        <w:t>TOP SECRET FILE</w:t>
+      </w:r>
+    </w:p>
+    <w:p/>
+    <w:p>
+      <w:r>
+        <w:t>TOP SECRET FILE</w:t>
+      </w:r>
+    </w:p>
+    <w:p>
+      <w:r>
+        <w:br w:type="page"/>
+      </w:r>
+    </w:p>
+    <w:p>
+      <w:r>
+        <w:lastRenderedPageBreak/>
+        <w:t>TOP SECRET FILE</w:t>
+      </w:r>
+    </w:p>
+    <w:p>
+      <w:r>
+        <w:br w:type="page"/>
+      </w:r>
+    </w:p>
+    <w:p>
+      <w:r>
+        <w:lastRenderedPageBreak/>
+        <w:t>TOP SECRET FILE</w:t>
+      </w:r>
+    </w:p>
+    <w:p>
+      <w:r>
+        <w:br w:type="page"/>
+      </w:r>
+    </w:p>
+    <w:p>
+      <w:r>
+        <w:lastRenderedPageBreak/>
+        <w:t>TOP SECRET FILE</w:t>
+      </w:r>
+    </w:p>
+    <w:p/>
+    <w:p>
+      <w:r>
+        <w:t>TOP SECRET FILE</w:t>
+      </w:r>
+    </w:p>
+    <w:p/>
+    <w:p>
+      <w:r>
+        <w:t>TOP SECRET FILE</w:t>
+      </w:r>
+    </w:p>
+    <w:p/>
+    <w:p>
+      <w:r>
+        <w:t>V</w:t>
+      </w:r>
+    </w:p>
+    <w:p>
+      <w:r>
+        <w:t>V</w:t>
+      </w:r>
+    </w:p>
+    <w:p>
+      <w:r>
+        <w:t>V</w:t>
+      </w:r>
+    </w:p>
+    <w:p>
+      <w:r>
+        <w:t>V</w:t>
+      </w:r>
+    </w:p>
+    <w:p>
+      <w:r>
+        <w:t>V</w:t>
+      </w:r>
+    </w:p>
+    <w:p>
+      <w:r>
+        <w:t>TOP SECRET FILE</w:t>
+      </w:r>
+    </w:p>
+    <w:p/>
+    <w:p>
+      <w:r>
+        <w:t>TOP SECRET FILE</w:t>
+      </w:r>
+    </w:p>
+    <w:p/>
+    <w:p>
+      <w:r>
+        <w:t>TOP SECRET FILE</w:t>
+      </w:r>
+    </w:p>
+    <w:p>
+      <w:r>
+        <w:br w:type="page"/>
+      </w:r>
+    </w:p>
+    <w:p>
+      <w:r>
+        <w:lastRenderedPageBreak/>
+        <w:t>TOP SECRET FILE</w:t>
+      </w:r>
+    </w:p>
+    <w:p>
+      <w:r>
+        <w:br w:type="page"/>
+      </w:r>
+    </w:p>
+    <w:p>
+      <w:r>
+        <w:lastRenderedPageBreak/>
+        <w:t>TOP SECRET FILE</w:t>
+      </w:r>
+    </w:p>
+    <w:p/>
+    <w:p>
+      <w:r>
+        <w:t>\</w:t>
+      </w:r>
+      <w:r>
+        <w:t xml:space="preserve"> </w:t>
+      </w:r>
+      <w:r>
+        <w:t>TOP SECRET FILE</w:t>
+      </w:r>
+    </w:p>
+    <w:p/>
+    <w:p>
+      <w:r>
+        <w:t>V</w:t>
+      </w:r>
+    </w:p>
+    <w:p>
+      <w:r>
+        <w:t>TOP SECRET FILE</w:t>
+      </w:r>
+    </w:p>
+    <w:p/>
+    <w:p>
+      <w:r>
+        <w:t>TOP SECRET FILE</w:t>
+      </w:r>
+    </w:p>
+    <w:p>
+      <w:r>
+        <w:br w:type="page"/>
+      </w:r>
+    </w:p>
+    <w:p>
+      <w:r>
+        <w:lastRenderedPageBreak/>
+        <w:t>TOP SECRET FILE</w:t>
+      </w:r>
+    </w:p>
+    <w:p>
+      <w:r>
+        <w:br w:type="page"/>
+      </w:r>
+    </w:p>
+    <w:p>
+      <w:r>
+        <w:lastRenderedPageBreak/>
+        <w:t>TOP SECRET FILE</w:t>
+      </w:r>
+    </w:p>
+    <w:p>
+      <w:r>
+        <w:br w:type="page"/>
+      </w:r>
+    </w:p>
+    <w:p>
+      <w:r>
+        <w:lastRenderedPageBreak/>
+        <w:t>TOP SECRET FILE</w:t>
+      </w:r>
+    </w:p>
+    <w:p>
+      <w:r>
+        <w:br w:type="page"/>
+      </w:r>
+    </w:p>
+    <w:p>
+      <w:r>
+        <w:lastRenderedPageBreak/>
+        <w:t>TOP SECRET FILE</w:t>
+      </w:r>
+    </w:p>
+    <w:p/>
+    <w:p>
+      <w:r>
+        <w:t>TOP SECRET FILE</w:t>
+      </w:r>
+    </w:p>
+    <w:p>
+      <w:r>
+        <w:br w:type="page"/>
+      </w:r>
+    </w:p>
+    <w:p>
+      <w:r>
+        <w:lastRenderedPageBreak/>
+        <w:t>TOP SECRET FILE</w:t>
+      </w:r>
+    </w:p>
+    <w:p>
+      <w:r>
+        <w:br w:type="page"/>
+      </w:r>
+    </w:p>
+    <w:p>
+      <w:r>
+        <w:lastRenderedPageBreak/>
+        <w:t>TOP SECRET FILE</w:t>
+      </w:r>
+    </w:p>
+    <w:p/>
+    <w:p>
+      <w:r>
+        <w:t>TOP SECRET FILE</w:t>
+      </w:r>
+    </w:p>
+    <w:p/>
+    <w:p>
+      <w:r>
+        <w:t>TOP SECRET FILE</w:t>
+      </w:r>
+    </w:p>
+    <w:p/>
     <w:sectPr>
       <w:pgSz w:w="12240" w:h="15840"/>
       <w:pgMar w:top="1440" w:right="1440" w:bottom="1440" w:left="1440" w:header="720" w:footer="720" w:gutter="0"/>

</xml_diff>